<commit_message>
ISO W10 sapuan form Legal: LEG-FRM-03, LEG-REG-01, LEG-REG-02
Lolos gerbang mesin W10 dan pemeriksa bahasa buta (semua skor >= 4).

Co-Authored-By: Claude Opus 5.5 <noreply@anthropic.com>
Claude-Session: https://claude.ai/code/session_01BhkCQM7h3krZb9kjY2Nate
</commit_message>
<xml_diff>
--- a/out/04_Legal/SNX-LEG-REG-01 Company Licenses & Permits Register (Rev00 DRAFT).docx
+++ b/out/04_Legal/SNX-LEG-REG-01 Company Licenses & Permits Register (Rev00 DRAFT).docx
@@ -217,6 +217,7 @@
     <w:p>
       <w:pPr>
         <w:pStyle w:val="Heading1"/>
+        <w:keepNext/>
         <w:widowControl w:val="0"/>
         <w:spacing w:line="240" w:lineRule="auto"/>
         <w:ind w:right="407" w:firstLine="0"/>
@@ -511,6 +512,10 @@
         <w:gridCol w:w="5850"/>
       </w:tblGrid>
       <w:tr>
+        <w:trPr>
+          <w:cantSplit/>
+          <w:tblHeader/>
+        </w:trPr>
         <w:tc>
           <w:tcPr>
             <w:tcW w:w="3150" w:type="dxa"/>
@@ -523,6 +528,7 @@
           </w:tcPr>
           <w:p>
             <w:pPr>
+              <w:keepNext/>
               <w:widowControl w:val="0"/>
               <w:pBdr>
                 <w:top w:val="nil"/>
@@ -563,6 +569,7 @@
           </w:tcPr>
           <w:p>
             <w:pPr>
+              <w:keepNext/>
               <w:widowControl w:val="0"/>
               <w:pBdr>
                 <w:top w:val="nil"/>
@@ -593,6 +600,9 @@
         </w:tc>
       </w:tr>
       <w:tr>
+        <w:trPr>
+          <w:cantSplit/>
+        </w:trPr>
         <w:tc>
           <w:tcPr>
             <w:tcW w:w="3150" w:type="dxa"/>
@@ -646,6 +656,9 @@
         </w:tc>
       </w:tr>
       <w:tr>
+        <w:trPr>
+          <w:cantSplit/>
+        </w:trPr>
         <w:tc>
           <w:tcPr>
             <w:tcW w:w="3150" w:type="dxa"/>
@@ -699,6 +712,9 @@
         </w:tc>
       </w:tr>
       <w:tr>
+        <w:trPr>
+          <w:cantSplit/>
+        </w:trPr>
         <w:tc>
           <w:tcPr>
             <w:tcW w:w="3150" w:type="dxa"/>
@@ -750,6 +766,9 @@
         </w:tc>
       </w:tr>
       <w:tr>
+        <w:trPr>
+          <w:cantSplit/>
+        </w:trPr>
         <w:tc>
           <w:tcPr>
             <w:tcW w:w="3150" w:type="dxa"/>
@@ -810,6 +829,9 @@
         </w:tc>
       </w:tr>
       <w:tr>
+        <w:trPr>
+          <w:cantSplit/>
+        </w:trPr>
         <w:tc>
           <w:tcPr>
             <w:tcW w:w="3150" w:type="dxa"/>
@@ -861,6 +883,9 @@
         </w:tc>
       </w:tr>
       <w:tr>
+        <w:trPr>
+          <w:cantSplit/>
+        </w:trPr>
         <w:tc>
           <w:tcPr>
             <w:tcW w:w="3150" w:type="dxa"/>
@@ -914,6 +939,9 @@
         </w:tc>
       </w:tr>
       <w:tr>
+        <w:trPr>
+          <w:cantSplit/>
+        </w:trPr>
         <w:tc>
           <w:tcPr>
             <w:tcW w:w="3150" w:type="dxa"/>
@@ -967,6 +995,9 @@
         </w:tc>
       </w:tr>
       <w:tr>
+        <w:trPr>
+          <w:cantSplit/>
+        </w:trPr>
         <w:tc>
           <w:tcPr>
             <w:tcW w:w="3150" w:type="dxa"/>
@@ -1020,6 +1051,9 @@
         </w:tc>
       </w:tr>
       <w:tr>
+        <w:trPr>
+          <w:cantSplit/>
+        </w:trPr>
         <w:tc>
           <w:tcPr>
             <w:tcW w:w="3150" w:type="dxa"/>
@@ -1073,6 +1107,9 @@
         </w:tc>
       </w:tr>
       <w:tr>
+        <w:trPr>
+          <w:cantSplit/>
+        </w:trPr>
         <w:tc>
           <w:tcPr>
             <w:tcW w:w="3150" w:type="dxa"/>
@@ -1126,6 +1163,9 @@
         </w:tc>
       </w:tr>
       <w:tr>
+        <w:trPr>
+          <w:cantSplit/>
+        </w:trPr>
         <w:tc>
           <w:tcPr>
             <w:tcW w:w="3150" w:type="dxa"/>
@@ -1207,6 +1247,7 @@
     <w:p>
       <w:pPr>
         <w:pStyle w:val="Heading1"/>
+        <w:keepNext/>
         <w:widowControl w:val="0"/>
         <w:spacing w:before="816" w:line="240" w:lineRule="auto"/>
         <w:ind w:right="407"/>
@@ -1243,6 +1284,10 @@
         <w:gridCol w:w="3010"/>
       </w:tblGrid>
       <w:tr>
+        <w:trPr>
+          <w:cantSplit/>
+          <w:tblHeader/>
+        </w:trPr>
         <w:tc>
           <w:tcPr>
             <w:tcW w:w="3009" w:type="dxa"/>
@@ -1255,6 +1300,7 @@
           </w:tcPr>
           <w:p>
             <w:pPr>
+              <w:keepNext/>
               <w:widowControl w:val="0"/>
               <w:spacing w:line="240" w:lineRule="auto"/>
               <w:jc w:val="center"/>
@@ -1288,6 +1334,7 @@
           </w:tcPr>
           <w:p>
             <w:pPr>
+              <w:keepNext/>
               <w:widowControl w:val="0"/>
               <w:spacing w:line="240" w:lineRule="auto"/>
               <w:jc w:val="center"/>
@@ -1321,6 +1368,7 @@
           </w:tcPr>
           <w:p>
             <w:pPr>
+              <w:keepNext/>
               <w:widowControl w:val="0"/>
               <w:spacing w:line="240" w:lineRule="auto"/>
               <w:jc w:val="center"/>
@@ -1344,6 +1392,9 @@
         </w:tc>
       </w:tr>
       <w:tr>
+        <w:trPr>
+          <w:cantSplit/>
+        </w:trPr>
         <w:tc>
           <w:tcPr>
             <w:tcW w:w="3009" w:type="dxa"/>
@@ -1392,6 +1443,9 @@
         </w:tc>
       </w:tr>
       <w:tr>
+        <w:trPr>
+          <w:cantSplit/>
+        </w:trPr>
         <w:tc>
           <w:tcPr>
             <w:tcW w:w="3009" w:type="dxa"/>
@@ -1463,6 +1517,9 @@
         </w:tc>
       </w:tr>
       <w:tr>
+        <w:trPr>
+          <w:cantSplit/>
+        </w:trPr>
         <w:tc>
           <w:tcPr>
             <w:tcW w:w="3009" w:type="dxa"/>
@@ -1537,6 +1594,7 @@
     <w:p>
       <w:pPr>
         <w:pStyle w:val="Heading1"/>
+        <w:keepNext/>
         <w:widowControl w:val="0"/>
         <w:spacing w:before="816" w:line="240" w:lineRule="auto"/>
         <w:ind w:right="407"/>
@@ -1578,6 +1636,10 @@
         <w:gridCol w:w="2235"/>
       </w:tblGrid>
       <w:tr>
+        <w:trPr>
+          <w:cantSplit/>
+          <w:tblHeader/>
+        </w:trPr>
         <w:tc>
           <w:tcPr>
             <w:tcW w:w="810" w:type="dxa"/>
@@ -1590,6 +1652,7 @@
           </w:tcPr>
           <w:p>
             <w:pPr>
+              <w:keepNext/>
               <w:widowControl w:val="0"/>
               <w:pBdr>
                 <w:top w:val="nil"/>
@@ -1630,6 +1693,7 @@
           </w:tcPr>
           <w:p>
             <w:pPr>
+              <w:keepNext/>
               <w:widowControl w:val="0"/>
               <w:spacing w:line="240" w:lineRule="auto"/>
               <w:jc w:val="center"/>
@@ -1663,6 +1727,7 @@
           </w:tcPr>
           <w:p>
             <w:pPr>
+              <w:keepNext/>
               <w:widowControl w:val="0"/>
               <w:pBdr>
                 <w:top w:val="nil"/>
@@ -1703,6 +1768,7 @@
           </w:tcPr>
           <w:p>
             <w:pPr>
+              <w:keepNext/>
               <w:widowControl w:val="0"/>
               <w:pBdr>
                 <w:top w:val="nil"/>
@@ -1733,6 +1799,9 @@
         </w:tc>
       </w:tr>
       <w:tr>
+        <w:trPr>
+          <w:cantSplit/>
+        </w:trPr>
         <w:tc>
           <w:tcPr>
             <w:tcW w:w="810" w:type="dxa"/>
@@ -1835,6 +1904,9 @@
         </w:tc>
       </w:tr>
       <w:tr>
+        <w:trPr>
+          <w:cantSplit/>
+        </w:trPr>
         <w:tc>
           <w:tcPr>
             <w:tcW w:w="810" w:type="dxa"/>
@@ -1937,6 +2009,9 @@
         </w:tc>
       </w:tr>
       <w:tr>
+        <w:trPr>
+          <w:cantSplit/>
+        </w:trPr>
         <w:tc>
           <w:tcPr>
             <w:tcW w:w="810" w:type="dxa"/>
@@ -2364,7 +2439,7 @@
           <w:sz w:val="24"/>
           <w:szCs w:val="24"/>
         </w:rPr>
-        <w:t xml:space="preserve">Register ini mencatat perizinan, persetujuan, pendaftaran, dan dokumen legalitas lain yang SINUX miliki atau wajib penuhi sesuai kegiatan usahanya dan peraturan perundang-undangan yang berlaku. Tiap baris memuat jenis izin, nomor, masa berlaku, dan jadwal perpanjangan.</w:t>
+        <w:t xml:space="preserve">Register ini mencatat perizinan, persetujuan, pendaftaran, dan dokumen legalitas lain yang dimiliki atau wajib dipenuhi SINUX sesuai kegiatan usahanya dan peraturan perundang-undangan yang berlaku. Setiap baris memuat jenis izin, nomor, masa berlaku, dan jadwal perpanjangan.</w:t>
       </w:r>
     </w:p>
     <w:p>
@@ -2425,7 +2500,7 @@
           <w:sz w:val="24"/>
           <w:szCs w:val="24"/>
         </w:rPr>
-        <w:t xml:space="preserve">Register mencakup akta pendirian dan akta perubahan, Anggaran Dasar, NIB, KBLI, NPWP perusahaan, serta surat keputusan atau surat penerimaan pemberitahuan dari instansi yang berwenang. Register juga mencakup perizinan berusaha dan sertifikat standar melalui OSS berbasis risiko (apabila dipersyaratkan), perizinan, persetujuan, atau pendaftaran sektoral yang relevan, dan dokumen legalitas lain yang diwajibkan oleh kegiatan usaha, ketentuan hukum, atau persyaratan kontraktual. Daftar ini tidak membatasi jenis dokumen yang boleh dicatat.</w:t>
+        <w:t xml:space="preserve">Register mencakup akta pendirian dan akta perubahan, Anggaran Dasar, NIB, KBLI, NPWP perusahaan, serta surat keputusan atau surat penerimaan pemberitahuan dari instansi yang berwenang. Register juga mencakup perizinan berusaha dan sertifikat standar melalui OSS berbasis risiko jika dipersyaratkan, serta perizinan, persetujuan, atau pendaftaran sektoral yang relevan. Dokumen legalitas lain yang diwajibkan kegiatan usaha, ketentuan hukum, atau persyaratan kontraktual juga dicatat. Daftar ini tidak membatasi jenis dokumen yang boleh dicatat.</w:t>
       </w:r>
     </w:p>
     <w:p>
@@ -2473,7 +2548,7 @@
           <w:sz w:val="24"/>
           <w:szCs w:val="24"/>
         </w:rPr>
-        <w:t xml:space="preserve">Register tidak mencatat kontrak dengan pelanggan atau vendor, yang diatur di SNX-LEG-SOP-01, dan tidak memuat daftar peraturan perundang-undangan, yang menjadi isi SNX-LEG-REG-03 (USULAN).</w:t>
+        <w:t xml:space="preserve">Register ini tidak mencatat kontrak dengan pelanggan atau vendor, yang diatur dalam SNX-LEG-SOP-01. Register ini juga tidak memuat daftar peraturan perundang-undangan, yang dicatat di SNX-LEG-REG-03 (USULAN).</w:t>
       </w:r>
     </w:p>
     <w:p>
@@ -2492,6 +2567,7 @@
     <w:p>
       <w:pPr>
         <w:pStyle w:val="Heading2"/>
+        <w:keepNext/>
         <w:numPr>
           <w:ilvl w:val="1"/>
           <w:numId w:val="7"/>
@@ -2517,6 +2593,8 @@
       </w:tblGrid>
       <w:tr>
         <w:trPr>
+          <w:cantSplit/>
+          <w:tblHeader/>
           <w:jc w:val="center"/>
         </w:trPr>
         <w:tc>
@@ -2532,6 +2610,7 @@
           </w:tcPr>
           <w:p>
             <w:pPr>
+              <w:keepNext/>
               <w:jc w:val="center"/>
               <w:rPr>
                 <w:sz w:val="24"/>
@@ -2562,6 +2641,7 @@
           </w:tcPr>
           <w:p>
             <w:pPr>
+              <w:keepNext/>
               <w:jc w:val="center"/>
               <w:rPr>
                 <w:sz w:val="24"/>
@@ -2582,6 +2662,7 @@
       </w:tr>
       <w:tr>
         <w:trPr>
+          <w:cantSplit/>
           <w:jc w:val="center"/>
         </w:trPr>
         <w:tc>
@@ -2636,13 +2717,14 @@
                 <w:sz w:val="24"/>
                 <w:szCs w:val="24"/>
               </w:rPr>
-              <w:t>Label untuk isi yang belum diputus secara tertulis oleh pimpinan SINUX.</w:t>
+              <w:t>Label untuk isi yang belum diputuskan secara tertulis oleh pimpinan SINUX.</w:t>
             </w:r>
           </w:p>
         </w:tc>
       </w:tr>
       <w:tr>
         <w:trPr>
+          <w:cantSplit/>
           <w:jc w:val="center"/>
         </w:trPr>
         <w:tc>
@@ -2704,6 +2786,7 @@
       </w:tr>
       <w:tr>
         <w:trPr>
+          <w:cantSplit/>
           <w:jc w:val="center"/>
         </w:trPr>
         <w:tc>
@@ -2765,6 +2848,7 @@
       </w:tr>
       <w:tr>
         <w:trPr>
+          <w:cantSplit/>
           <w:jc w:val="center"/>
         </w:trPr>
         <w:tc>
@@ -2826,6 +2910,7 @@
       </w:tr>
       <w:tr>
         <w:trPr>
+          <w:cantSplit/>
           <w:jc w:val="center"/>
         </w:trPr>
         <w:tc>
@@ -2887,6 +2972,7 @@
       </w:tr>
       <w:tr>
         <w:trPr>
+          <w:cantSplit/>
           <w:jc w:val="center"/>
         </w:trPr>
         <w:tc>
@@ -2948,6 +3034,7 @@
       </w:tr>
       <w:tr>
         <w:trPr>
+          <w:cantSplit/>
           <w:jc w:val="center"/>
         </w:trPr>
         <w:tc>
@@ -3002,13 +3089,14 @@
                 <w:sz w:val="24"/>
                 <w:szCs w:val="24"/>
               </w:rPr>
-              <w:t>Jangka waktu berlakunya sebuah dokumen, ditulis sebagai tanggal berakhir. Tidak semua dokumen memilikinya.</w:t>
+              <w:t>Jangka waktu berlakunya sebuah dokumen, ditulis sebagai tanggal berakhir. Tidak semua dokumen punya masa berlaku.</w:t>
             </w:r>
           </w:p>
         </w:tc>
       </w:tr>
       <w:tr>
         <w:trPr>
+          <w:cantSplit/>
           <w:jc w:val="center"/>
         </w:trPr>
         <w:tc>
@@ -3063,13 +3151,14 @@
                 <w:sz w:val="24"/>
                 <w:szCs w:val="24"/>
               </w:rPr>
-              <w:t>Nomor Induk Berusaha: identitas pelaku usaha yang terbit lewat OSS.</w:t>
+              <w:t>Nomor Induk Berusaha: identitas pelaku usaha yang terbit melalui OSS.</w:t>
             </w:r>
           </w:p>
         </w:tc>
       </w:tr>
       <w:tr>
         <w:trPr>
+          <w:cantSplit/>
           <w:jc w:val="center"/>
         </w:trPr>
         <w:tc>
@@ -3131,6 +3220,7 @@
       </w:tr>
       <w:tr>
         <w:trPr>
+          <w:cantSplit/>
           <w:jc w:val="center"/>
         </w:trPr>
         <w:tc>
@@ -3192,6 +3282,7 @@
       </w:tr>
       <w:tr>
         <w:trPr>
+          <w:cantSplit/>
           <w:jc w:val="center"/>
         </w:trPr>
         <w:tc>
@@ -3246,13 +3337,14 @@
                 <w:sz w:val="24"/>
                 <w:szCs w:val="24"/>
               </w:rPr>
-              <w:t>Jabatan yang mengurus dan memantau satu dokumen di register, ditulis pada kolom Penanggung Jawab.</w:t>
+              <w:t>Jabatan yang mengurus dan memantau satu dokumen di register, ditulis di kolom Penanggung Jawab.</w:t>
             </w:r>
           </w:p>
         </w:tc>
       </w:tr>
       <w:tr>
         <w:trPr>
+          <w:cantSplit/>
           <w:jc w:val="center"/>
         </w:trPr>
         <w:tc>
@@ -3307,13 +3399,14 @@
                 <w:sz w:val="24"/>
                 <w:szCs w:val="24"/>
               </w:rPr>
-              <w:t>Pekerjaan untuk melengkapi, memverifikasi, atau memperbarui satu dokumen, dicatat pada tabel Tindak Lanjut.</w:t>
+              <w:t>Pekerjaan untuk melengkapi, memverifikasi, atau memperbarui satu dokumen, dicatat di tabel Tindak Lanjut.</w:t>
             </w:r>
           </w:p>
         </w:tc>
       </w:tr>
       <w:tr>
         <w:trPr>
+          <w:cantSplit/>
           <w:jc w:val="center"/>
         </w:trPr>
         <w:tc>
@@ -3413,6 +3506,7 @@
     </w:p>
     <w:p>
       <w:pPr>
+        <w:keepNext/>
         <w:pBdr>
           <w:top w:val="nil"/>
           <w:left w:val="nil"/>
@@ -3432,7 +3526,7 @@
           <w:sz w:val="24"/>
           <w:szCs w:val="24"/>
         </w:rPr>
-        <w:t xml:space="preserve">Kolom Status memakai enam nilai berikut secara konsisten.</w:t>
+        <w:t xml:space="preserve">Kolom Status diisi dengan salah satu dari enam nilai berikut.</w:t>
       </w:r>
     </w:p>
     <w:tbl>
@@ -3450,6 +3544,8 @@
       </w:tblGrid>
       <w:tr>
         <w:trPr>
+          <w:cantSplit/>
+          <w:tblHeader/>
           <w:jc w:val="center"/>
         </w:trPr>
         <w:tc>
@@ -3465,6 +3561,7 @@
           </w:tcPr>
           <w:p>
             <w:pPr>
+              <w:keepNext/>
               <w:jc w:val="center"/>
               <w:rPr>
                 <w:sz w:val="24"/>
@@ -3495,6 +3592,7 @@
           </w:tcPr>
           <w:p>
             <w:pPr>
+              <w:keepNext/>
               <w:jc w:val="center"/>
               <w:rPr>
                 <w:sz w:val="24"/>
@@ -3515,6 +3613,7 @@
       </w:tr>
       <w:tr>
         <w:trPr>
+          <w:cantSplit/>
           <w:jc w:val="center"/>
         </w:trPr>
         <w:tc>
@@ -3569,13 +3668,14 @@
                 <w:sz w:val="24"/>
                 <w:szCs w:val="24"/>
               </w:rPr>
-              <w:t>Dokumen telah diperiksa dan masih berlaku, apabila memiliki masa berlaku.</w:t>
+              <w:t>Dokumen sudah diperiksa dan masih berlaku, jika punya masa berlaku.</w:t>
             </w:r>
           </w:p>
         </w:tc>
       </w:tr>
       <w:tr>
         <w:trPr>
+          <w:cantSplit/>
           <w:jc w:val="center"/>
         </w:trPr>
         <w:tc>
@@ -3637,6 +3737,7 @@
       </w:tr>
       <w:tr>
         <w:trPr>
+          <w:cantSplit/>
           <w:jc w:val="center"/>
         </w:trPr>
         <w:tc>
@@ -3691,13 +3792,14 @@
                 <w:sz w:val="24"/>
                 <w:szCs w:val="24"/>
               </w:rPr>
-              <w:t>Masa berlaku dokumen telah berakhir.</w:t>
+              <w:t>Masa berlaku dokumen sudah berakhir.</w:t>
             </w:r>
           </w:p>
         </w:tc>
       </w:tr>
       <w:tr>
         <w:trPr>
+          <w:cantSplit/>
           <w:jc w:val="center"/>
         </w:trPr>
         <w:tc>
@@ -3759,6 +3861,7 @@
       </w:tr>
       <w:tr>
         <w:trPr>
+          <w:cantSplit/>
           <w:jc w:val="center"/>
         </w:trPr>
         <w:tc>
@@ -3820,6 +3923,7 @@
       </w:tr>
       <w:tr>
         <w:trPr>
+          <w:cantSplit/>
           <w:jc w:val="center"/>
         </w:trPr>
         <w:tc>
@@ -3874,7 +3978,7 @@
                 <w:sz w:val="24"/>
                 <w:szCs w:val="24"/>
               </w:rPr>
-              <w:t>Berdasarkan hasil pemeriksaan, dokumen tidak diwajibkan atau tidak relevan dengan kondisi perusahaan.</w:t>
+              <w:t>Hasil pemeriksaan menunjukkan dokumen tidak diwajibkan atau tidak relevan bagi SINUX.</w:t>
             </w:r>
           </w:p>
         </w:tc>
@@ -3962,7 +4066,7 @@
           <w:sz w:val="24"/>
           <w:szCs w:val="24"/>
         </w:rPr>
-        <w:t xml:space="preserve">2. Line Manager Legal memeriksa kelengkapan dan keakuratan isi register (USULAN) dan memverifikasi akta sebelum dinyatakan selesai (SNX-LEG-SOP-01, prosedur 6.6).</w:t>
+        <w:t xml:space="preserve">2. Line Manager Legal memeriksa kelengkapan dan keakuratan isi register (USULAN), serta memverifikasi akta sebelum dinyatakan selesai (SNX-LEG-SOP-01 prosedur 6.6).</w:t>
       </w:r>
     </w:p>
     <w:p>
@@ -3986,7 +4090,7 @@
           <w:sz w:val="24"/>
           <w:szCs w:val="24"/>
         </w:rPr>
-        <w:t xml:space="preserve">3. Unit Kerja Terkait menyampaikan dokumen dan informasi yang diminta Departemen Legal, dan memberi tahu Staff Legal bila ada perubahan kegiatan usaha atau kondisi SINUX yang dapat memengaruhi kewajiban perizinan.</w:t>
+        <w:t xml:space="preserve">3. Unit Kerja Terkait menyampaikan dokumen dan informasi yang diminta Departemen Legal. Perubahan kegiatan usaha atau kondisi SINUX yang dapat memengaruhi kewajiban perizinan juga diberitahukan kepada Staff Legal.</w:t>
       </w:r>
     </w:p>
     <w:p>
@@ -4010,7 +4114,7 @@
           <w:sz w:val="24"/>
           <w:szCs w:val="24"/>
         </w:rPr>
-        <w:t xml:space="preserve">4. Departemen Legal memverifikasi kewajiban tiap jenis dokumen menurut kondisi dan kegiatan usaha SINUX. Dokumen yang hasilnya tidak diwajibkan diberi status Tidak Berlaku untuk Perusahaan.</w:t>
+        <w:t xml:space="preserve">4. Departemen Legal memverifikasi kewajiban setiap jenis dokumen menurut kondisi dan kegiatan usaha SINUX. Dokumen yang ternyata tidak diwajibkan diberi status Tidak Berlaku untuk Perusahaan.</w:t>
       </w:r>
     </w:p>
     <w:p>
@@ -4058,7 +4162,7 @@
           <w:sz w:val="24"/>
           <w:szCs w:val="24"/>
         </w:rPr>
-        <w:t xml:space="preserve">6. Staff Legal memantau dokumen yang punya masa berlaku menurut tanggal berakhir dan ketentuan perpanjangan yang berlaku. Staff Legal mengirim pengingat perpanjangan ke penanggung jawab izin pada tanggal di kolom Jadwal Perpanjangan.</w:t>
+        <w:t xml:space="preserve">6. Staff Legal memantau dokumen yang punya masa berlaku menurut tanggal berakhir dan ketentuan perpanjangannya. Pengingat perpanjangan dikirim ke penanggung jawab izin pada tanggal di kolom Jadwal Perpanjangan.</w:t>
       </w:r>
     </w:p>
     <w:p>
@@ -4082,7 +4186,7 @@
           <w:sz w:val="24"/>
           <w:szCs w:val="24"/>
         </w:rPr>
-        <w:t xml:space="preserve">7. Staff Legal mencatat dokumen berstatus Belum Tersedia atau Belum Diverifikasi di register dan menindaklanjutinya kepada pihak yang relevan. Staff Legal memperlakukan dokumen berstatus Perlu Diperbarui atau Kedaluwarsa dengan cara yang sama (USULAN).</w:t>
+        <w:t xml:space="preserve">7. Staff Legal mencatat dokumen berstatus Belum Tersedia atau Belum Diverifikasi di register, lalu menindaklanjutinya dengan pihak yang relevan. Dokumen berstatus Perlu Diperbarui atau Kedaluwarsa ditangani dengan cara yang sama (USULAN).</w:t>
       </w:r>
     </w:p>
     <w:p>
@@ -4154,7 +4258,7 @@
           <w:sz w:val="24"/>
           <w:szCs w:val="24"/>
         </w:rPr>
-        <w:t xml:space="preserve">10. Staff Legal menyimpan bukti pendukung di folder Google Drive departemen Legal (USULAN, SNX-LEG-SOP-01 butir 4.24) dan menulis lokasinya di kolom Lokasi Bukti. Pejabat yang Berwenang dapat mengakses bukti itu.</w:t>
+        <w:t xml:space="preserve">10. Staff Legal menyimpan bukti pendukung di folder Google Drive Departemen Legal (USULAN, SNX-LEG-SOP-01 butir 4.24) dan menulis lokasinya di kolom Lokasi Bukti. Bukti itu dapat diakses Pejabat yang Berwenang.</w:t>
       </w:r>
     </w:p>
     <w:p>
@@ -4184,6 +4288,7 @@
     <w:p>
       <w:pPr>
         <w:pStyle w:val="Heading1"/>
+        <w:keepNext/>
         <w:numPr>
           <w:ilvl w:val="0"/>
           <w:numId w:val="7"/>
@@ -4209,6 +4314,8 @@
       </w:tblGrid>
       <w:tr>
         <w:trPr>
+          <w:cantSplit/>
+          <w:tblHeader/>
           <w:jc w:val="center"/>
         </w:trPr>
         <w:tc>
@@ -4224,6 +4331,7 @@
           </w:tcPr>
           <w:p>
             <w:pPr>
+              <w:keepNext/>
               <w:jc w:val="center"/>
               <w:rPr>
                 <w:sz w:val="24"/>
@@ -4254,6 +4362,7 @@
           </w:tcPr>
           <w:p>
             <w:pPr>
+              <w:keepNext/>
               <w:jc w:val="center"/>
               <w:rPr>
                 <w:sz w:val="24"/>
@@ -4274,6 +4383,7 @@
       </w:tr>
       <w:tr>
         <w:trPr>
+          <w:cantSplit/>
           <w:jc w:val="center"/>
         </w:trPr>
         <w:tc>
@@ -4328,13 +4438,14 @@
                 <w:sz w:val="24"/>
                 <w:szCs w:val="24"/>
               </w:rPr>
-              <w:t>Dipetakan ke jabatan Legal &amp; Compliance (JA-09) di SNX-HR-ORG-01. Mengisi dan memperbarui register, meninjaunya tiap bulan, mengirim pengingat perpanjangan, menyimpan bukti pendukung, dan mencatat tindak lanjut serta hasil pemeriksaan (Ketentuan butir 1, 5 sampai 7, 9 sampai 11).</w:t>
+              <w:t>Mengisi dan memperbarui register, meninjaunya setiap bulan, mengirim pengingat perpanjangan, menyimpan bukti pendukung, serta mencatat tindak lanjut dan hasil pemeriksaan. Jabatan: Legal &amp; Compliance (JA-09).</w:t>
             </w:r>
           </w:p>
         </w:tc>
       </w:tr>
       <w:tr>
         <w:trPr>
+          <w:cantSplit/>
           <w:jc w:val="center"/>
         </w:trPr>
         <w:tc>
@@ -4389,13 +4500,14 @@
                 <w:sz w:val="24"/>
                 <w:szCs w:val="24"/>
               </w:rPr>
-              <w:t>Dipetakan ke jabatan Legal &amp; Compliance (JA-08) di SNX-HR-ORG-01. Pemilik dokumen dan pemilik rekaman register ini (USULAN). Memeriksa isi register dan memverifikasi akta (Ketentuan butir 2).</w:t>
+              <w:t>Memeriksa isi register dan memverifikasi akta. Jabatan: Legal &amp; Compliance (JA-08). Pemilik dokumen dan pemilik record (rekaman) register ini (USULAN).</w:t>
             </w:r>
           </w:p>
         </w:tc>
       </w:tr>
       <w:tr>
         <w:trPr>
+          <w:cantSplit/>
           <w:jc w:val="center"/>
         </w:trPr>
         <w:tc>
@@ -4450,13 +4562,14 @@
                 <w:sz w:val="24"/>
                 <w:szCs w:val="24"/>
               </w:rPr>
-              <w:t>Gabungan Line Manager Legal dan Staff Legal. Menerima dokumen dan informasi dari Unit Kerja Terkait (Ketentuan butir 3) dan memverifikasi kewajiban tiap jenis dokumen (Ketentuan butir 4).</w:t>
+              <w:t>Gabungan Line Manager Legal dan Staff Legal. Menerima dokumen dan informasi dari Unit Kerja Terkait, serta memverifikasi kewajiban setiap jenis dokumen.</w:t>
             </w:r>
           </w:p>
         </w:tc>
       </w:tr>
       <w:tr>
         <w:trPr>
+          <w:cantSplit/>
           <w:jc w:val="center"/>
         </w:trPr>
         <w:tc>
@@ -4511,13 +4624,14 @@
                 <w:sz w:val="24"/>
                 <w:szCs w:val="24"/>
               </w:rPr>
-              <w:t>Menyampaikan dokumen dan informasi, serta melaporkan perubahan yang memengaruhi kewajiban perizinan (Ketentuan butir 3).</w:t>
+              <w:t>Menyampaikan dokumen dan informasi, serta melaporkan perubahan yang memengaruhi kewajiban perizinan.</w:t>
             </w:r>
           </w:p>
         </w:tc>
       </w:tr>
       <w:tr>
         <w:trPr>
+          <w:cantSplit/>
           <w:jc w:val="center"/>
         </w:trPr>
         <w:tc>
@@ -4572,13 +4686,14 @@
                 <w:sz w:val="24"/>
                 <w:szCs w:val="24"/>
               </w:rPr>
-              <w:t>Menerima pengingat perpanjangan dari Staff Legal dan menjalankan tindakan yang tercatat atas jabatannya di tabel Tindak Lanjut (Ketentuan butir 6 dan 8).</w:t>
+              <w:t>Menerima pengingat perpanjangan dari Staff Legal dan menjalankan tindakan yang dicatat untuk jabatannya di tabel Tindak Lanjut.</w:t>
             </w:r>
           </w:p>
         </w:tc>
       </w:tr>
       <w:tr>
         <w:trPr>
+          <w:cantSplit/>
           <w:jc w:val="center"/>
         </w:trPr>
         <w:tc>
@@ -4633,7 +4748,7 @@
                 <w:sz w:val="24"/>
                 <w:szCs w:val="24"/>
               </w:rPr>
-              <w:t>Melakukan pemeriksaan atau persetujuan sesuai mekanisme internal SINUX yang berlaku, dan dapat mengakses bukti pendukung (Ketentuan butir 10). Jabatan pemegang peran ini belum dipetakan (USULAN: diputuskan Legal).</w:t>
+              <w:t>Melakukan pemeriksaan atau persetujuan sesuai mekanisme internal SINUX yang berlaku, dan dapat mengakses bukti pendukung. Jabatan pemegang peran ini belum dipetakan (USULAN: diputuskan Legal).</w:t>
             </w:r>
           </w:p>
         </w:tc>
@@ -4684,7 +4799,7 @@
           <w:sz w:val="24"/>
           <w:szCs w:val="24"/>
         </w:rPr>
-        <w:t xml:space="preserve">Pembuat, pemeriksa, dan penyetuju dokumen ini tercantum di blok Approval pada halaman depan.</w:t>
+        <w:t xml:space="preserve">Pembuat, pemeriksa, dan penyetuju dokumen ini tercantum di blok Approval di halaman depan.</w:t>
       </w:r>
     </w:p>
     <w:p>
@@ -4721,7 +4836,7 @@
           <w:sz w:val="24"/>
           <w:szCs w:val="24"/>
         </w:rPr>
-        <w:t xml:space="preserve">1. Sel data pada tabel Daftar Perizinan dan tabel Penerbitan, Penanggung Jawab, dan Lokasi Bukti kosong. Staff Legal mengisinya dari dokumen asli, satu baris untuk satu dokumen.</w:t>
+        <w:t xml:space="preserve">1. Sel data di tabel Daftar Perizinan dan tabel Penerbitan, Penanggung Jawab, dan Lokasi Bukti masih kosong. Isi dari dokumen asli, satu baris untuk satu dokumen.</w:t>
       </w:r>
     </w:p>
     <w:p>
@@ -4745,7 +4860,7 @@
           <w:sz w:val="24"/>
           <w:szCs w:val="24"/>
         </w:rPr>
-        <w:t xml:space="preserve">2. Staff Legal menambah baris bila satu jenis izin punya lebih dari satu dokumen, misalnya akta perubahan.</w:t>
+        <w:t xml:space="preserve">2. Tambah baris jika satu jenis izin punya lebih dari satu dokumen, misalnya akta perubahan.</w:t>
       </w:r>
     </w:p>
     <w:p>
@@ -4769,7 +4884,7 @@
           <w:sz w:val="24"/>
           <w:szCs w:val="24"/>
         </w:rPr>
-        <w:t xml:space="preserve">3. Kolom Nomor memuat nomor yang tertera pada dokumen asli. Untuk KBLI, Staff Legal menulis kode KBLI kegiatan usaha SINUX.</w:t>
+        <w:t xml:space="preserve">3. Di kolom Nomor, tulis nomor yang tertera pada dokumen asli. Untuk KBLI, tulis kode KBLI kegiatan usaha SINUX.</w:t>
       </w:r>
     </w:p>
     <w:p>
@@ -4793,7 +4908,7 @@
           <w:sz w:val="24"/>
           <w:szCs w:val="24"/>
         </w:rPr>
-        <w:t xml:space="preserve">4. Kolom Masa Berlaku memuat tanggal berakhir. Untuk dokumen yang tidak punya masa berlaku, Staff Legal menulis tidak ada masa berlaku.</w:t>
+        <w:t xml:space="preserve">4. Di kolom Masa Berlaku, tulis tanggal berakhir. Untuk dokumen tanpa masa berlaku, tulis tidak ada masa berlaku.</w:t>
       </w:r>
     </w:p>
     <w:p>
@@ -4817,7 +4932,7 @@
           <w:sz w:val="24"/>
           <w:szCs w:val="24"/>
         </w:rPr>
-        <w:t xml:space="preserve">5. Kolom Jadwal Perpanjangan memuat tanggal pengingat, yaitu 90 hari sebelum masa berlaku berakhir (SNX-LEG-SOP-01, bagian 8), dan tanggal target pengajuan perpanjangan (USULAN).</w:t>
+        <w:t xml:space="preserve">5. Di kolom Jadwal Perpanjangan, tulis tanggal pengingat, yaitu 90 hari sebelum masa berlaku berakhir (SNX-LEG-SOP-01 bagian 8), dan tanggal target pengajuan perpanjangan (USULAN).</w:t>
       </w:r>
     </w:p>
     <w:p>
@@ -4841,7 +4956,7 @@
           <w:sz w:val="24"/>
           <w:szCs w:val="24"/>
         </w:rPr>
-        <w:t xml:space="preserve">6. Kolom Status memakai salah satu dari enam status pada bagian Istilah. Staff Legal memberi status Belum Diverifikasi pada baris yang belum diperiksa.</w:t>
+        <w:t xml:space="preserve">6. Isi kolom Status dengan salah satu dari enam nilai Status Dokumen. Beri status Belum Diverifikasi pada baris yang belum diperiksa.</w:t>
       </w:r>
     </w:p>
     <w:p>
@@ -4865,7 +4980,7 @@
           <w:sz w:val="24"/>
           <w:szCs w:val="24"/>
         </w:rPr>
-        <w:t xml:space="preserve">7. Kolom Penanggung Jawab memuat nama jabatan menurut SNX-HR-ORG-01, bukan nama orang (USULAN).</w:t>
+        <w:t xml:space="preserve">7. Di kolom Penanggung Jawab, tulis nama jabatan menurut SNX-HR-ORG-01, bukan nama orang (USULAN).</w:t>
       </w:r>
     </w:p>
     <w:p>
@@ -4889,7 +5004,7 @@
           <w:sz w:val="24"/>
           <w:szCs w:val="24"/>
         </w:rPr>
-        <w:t xml:space="preserve">8. Tabel Penerbitan, Penanggung Jawab, dan Lokasi Bukti memakai nomor baris yang sama dengan tabel Daftar Perizinan.</w:t>
+        <w:t xml:space="preserve">8. Pakai nomor baris yang sama di tabel Penerbitan, Penanggung Jawab, dan Lokasi Bukti seperti di tabel Daftar Perizinan.</w:t>
       </w:r>
     </w:p>
     <w:p>
@@ -4913,7 +5028,7 @@
           <w:sz w:val="24"/>
           <w:szCs w:val="24"/>
         </w:rPr>
-        <w:t xml:space="preserve">9. Staff Legal mengisi tabel Tindak Lanjut dan Catatan Pemeriksaan sesuai Ketentuan butir 7, 8, dan 11.</w:t>
+        <w:t xml:space="preserve">9. Isi tabel Tindak Lanjut untuk setiap dokumen yang perlu ditindaklanjuti, dan catat setiap pemeriksaan di tabel Catatan Pemeriksaan.</w:t>
       </w:r>
     </w:p>
     <w:p>
@@ -4956,6 +5071,7 @@
     <w:p>
       <w:pPr>
         <w:pStyle w:val="Heading2"/>
+        <w:keepNext/>
         <w:numPr>
           <w:ilvl w:val="1"/>
           <w:numId w:val="7"/>
@@ -4985,6 +5101,8 @@
       </w:tblGrid>
       <w:tr>
         <w:trPr>
+          <w:cantSplit/>
+          <w:tblHeader/>
           <w:jc w:val="center"/>
         </w:trPr>
         <w:tc>
@@ -5000,6 +5118,7 @@
           </w:tcPr>
           <w:p>
             <w:pPr>
+              <w:keepNext/>
               <w:jc w:val="center"/>
               <w:rPr>
                 <w:sz w:val="24"/>
@@ -5030,6 +5149,7 @@
           </w:tcPr>
           <w:p>
             <w:pPr>
+              <w:keepNext/>
               <w:jc w:val="center"/>
               <w:rPr>
                 <w:sz w:val="24"/>
@@ -5060,6 +5180,7 @@
           </w:tcPr>
           <w:p>
             <w:pPr>
+              <w:keepNext/>
               <w:jc w:val="center"/>
               <w:rPr>
                 <w:sz w:val="24"/>
@@ -5090,6 +5211,7 @@
           </w:tcPr>
           <w:p>
             <w:pPr>
+              <w:keepNext/>
               <w:jc w:val="center"/>
               <w:rPr>
                 <w:sz w:val="24"/>
@@ -5120,6 +5242,7 @@
           </w:tcPr>
           <w:p>
             <w:pPr>
+              <w:keepNext/>
               <w:jc w:val="center"/>
               <w:rPr>
                 <w:sz w:val="24"/>
@@ -5150,6 +5273,7 @@
           </w:tcPr>
           <w:p>
             <w:pPr>
+              <w:keepNext/>
               <w:jc w:val="center"/>
               <w:rPr>
                 <w:sz w:val="24"/>
@@ -5170,6 +5294,7 @@
       </w:tr>
       <w:tr>
         <w:trPr>
+          <w:cantSplit/>
           <w:jc w:val="center"/>
         </w:trPr>
         <w:tc>
@@ -5241,7 +5366,7 @@
           </w:tcPr>
           <w:p>
             <w:pPr>
-              <w:jc w:val="both"/>
+              <w:jc w:val="left"/>
               <w:rPr>
                 <w:sz w:val="24"/>
                 <w:szCs w:val="24"/>
@@ -5269,7 +5394,7 @@
           </w:tcPr>
           <w:p>
             <w:pPr>
-              <w:jc w:val="both"/>
+              <w:jc w:val="left"/>
               <w:rPr>
                 <w:sz w:val="24"/>
                 <w:szCs w:val="24"/>
@@ -5297,7 +5422,7 @@
           </w:tcPr>
           <w:p>
             <w:pPr>
-              <w:jc w:val="both"/>
+              <w:jc w:val="left"/>
               <w:rPr>
                 <w:sz w:val="24"/>
                 <w:szCs w:val="24"/>
@@ -5325,7 +5450,7 @@
           </w:tcPr>
           <w:p>
             <w:pPr>
-              <w:jc w:val="both"/>
+              <w:jc w:val="left"/>
               <w:rPr>
                 <w:sz w:val="24"/>
                 <w:szCs w:val="24"/>
@@ -5343,6 +5468,7 @@
       </w:tr>
       <w:tr>
         <w:trPr>
+          <w:cantSplit/>
           <w:jc w:val="center"/>
         </w:trPr>
         <w:tc>
@@ -5414,7 +5540,7 @@
           </w:tcPr>
           <w:p>
             <w:pPr>
-              <w:jc w:val="both"/>
+              <w:jc w:val="left"/>
               <w:rPr>
                 <w:sz w:val="24"/>
                 <w:szCs w:val="24"/>
@@ -5442,7 +5568,7 @@
           </w:tcPr>
           <w:p>
             <w:pPr>
-              <w:jc w:val="both"/>
+              <w:jc w:val="left"/>
               <w:rPr>
                 <w:sz w:val="24"/>
                 <w:szCs w:val="24"/>
@@ -5470,7 +5596,7 @@
           </w:tcPr>
           <w:p>
             <w:pPr>
-              <w:jc w:val="both"/>
+              <w:jc w:val="left"/>
               <w:rPr>
                 <w:sz w:val="24"/>
                 <w:szCs w:val="24"/>
@@ -5498,7 +5624,7 @@
           </w:tcPr>
           <w:p>
             <w:pPr>
-              <w:jc w:val="both"/>
+              <w:jc w:val="left"/>
               <w:rPr>
                 <w:sz w:val="24"/>
                 <w:szCs w:val="24"/>
@@ -5516,6 +5642,7 @@
       </w:tr>
       <w:tr>
         <w:trPr>
+          <w:cantSplit/>
           <w:jc w:val="center"/>
         </w:trPr>
         <w:tc>
@@ -5587,7 +5714,7 @@
           </w:tcPr>
           <w:p>
             <w:pPr>
-              <w:jc w:val="both"/>
+              <w:jc w:val="left"/>
               <w:rPr>
                 <w:sz w:val="24"/>
                 <w:szCs w:val="24"/>
@@ -5615,7 +5742,7 @@
           </w:tcPr>
           <w:p>
             <w:pPr>
-              <w:jc w:val="both"/>
+              <w:jc w:val="left"/>
               <w:rPr>
                 <w:sz w:val="24"/>
                 <w:szCs w:val="24"/>
@@ -5643,7 +5770,7 @@
           </w:tcPr>
           <w:p>
             <w:pPr>
-              <w:jc w:val="both"/>
+              <w:jc w:val="left"/>
               <w:rPr>
                 <w:sz w:val="24"/>
                 <w:szCs w:val="24"/>
@@ -5671,7 +5798,7 @@
           </w:tcPr>
           <w:p>
             <w:pPr>
-              <w:jc w:val="both"/>
+              <w:jc w:val="left"/>
               <w:rPr>
                 <w:sz w:val="24"/>
                 <w:szCs w:val="24"/>
@@ -5689,6 +5816,7 @@
       </w:tr>
       <w:tr>
         <w:trPr>
+          <w:cantSplit/>
           <w:jc w:val="center"/>
         </w:trPr>
         <w:tc>
@@ -5760,7 +5888,7 @@
           </w:tcPr>
           <w:p>
             <w:pPr>
-              <w:jc w:val="both"/>
+              <w:jc w:val="left"/>
               <w:rPr>
                 <w:sz w:val="24"/>
                 <w:szCs w:val="24"/>
@@ -5788,7 +5916,7 @@
           </w:tcPr>
           <w:p>
             <w:pPr>
-              <w:jc w:val="both"/>
+              <w:jc w:val="left"/>
               <w:rPr>
                 <w:sz w:val="24"/>
                 <w:szCs w:val="24"/>
@@ -5816,7 +5944,7 @@
           </w:tcPr>
           <w:p>
             <w:pPr>
-              <w:jc w:val="both"/>
+              <w:jc w:val="left"/>
               <w:rPr>
                 <w:sz w:val="24"/>
                 <w:szCs w:val="24"/>
@@ -5844,7 +5972,7 @@
           </w:tcPr>
           <w:p>
             <w:pPr>
-              <w:jc w:val="both"/>
+              <w:jc w:val="left"/>
               <w:rPr>
                 <w:sz w:val="24"/>
                 <w:szCs w:val="24"/>
@@ -5862,6 +5990,7 @@
       </w:tr>
       <w:tr>
         <w:trPr>
+          <w:cantSplit/>
           <w:jc w:val="center"/>
         </w:trPr>
         <w:tc>
@@ -5933,7 +6062,7 @@
           </w:tcPr>
           <w:p>
             <w:pPr>
-              <w:jc w:val="both"/>
+              <w:jc w:val="left"/>
               <w:rPr>
                 <w:sz w:val="24"/>
                 <w:szCs w:val="24"/>
@@ -5961,7 +6090,7 @@
           </w:tcPr>
           <w:p>
             <w:pPr>
-              <w:jc w:val="both"/>
+              <w:jc w:val="left"/>
               <w:rPr>
                 <w:sz w:val="24"/>
                 <w:szCs w:val="24"/>
@@ -5989,7 +6118,7 @@
           </w:tcPr>
           <w:p>
             <w:pPr>
-              <w:jc w:val="both"/>
+              <w:jc w:val="left"/>
               <w:rPr>
                 <w:sz w:val="24"/>
                 <w:szCs w:val="24"/>
@@ -6017,7 +6146,7 @@
           </w:tcPr>
           <w:p>
             <w:pPr>
-              <w:jc w:val="both"/>
+              <w:jc w:val="left"/>
               <w:rPr>
                 <w:sz w:val="24"/>
                 <w:szCs w:val="24"/>
@@ -6035,6 +6164,7 @@
       </w:tr>
       <w:tr>
         <w:trPr>
+          <w:cantSplit/>
           <w:jc w:val="center"/>
         </w:trPr>
         <w:tc>
@@ -6106,7 +6236,7 @@
           </w:tcPr>
           <w:p>
             <w:pPr>
-              <w:jc w:val="both"/>
+              <w:jc w:val="left"/>
               <w:rPr>
                 <w:sz w:val="24"/>
                 <w:szCs w:val="24"/>
@@ -6134,7 +6264,7 @@
           </w:tcPr>
           <w:p>
             <w:pPr>
-              <w:jc w:val="both"/>
+              <w:jc w:val="left"/>
               <w:rPr>
                 <w:sz w:val="24"/>
                 <w:szCs w:val="24"/>
@@ -6162,7 +6292,7 @@
           </w:tcPr>
           <w:p>
             <w:pPr>
-              <w:jc w:val="both"/>
+              <w:jc w:val="left"/>
               <w:rPr>
                 <w:sz w:val="24"/>
                 <w:szCs w:val="24"/>
@@ -6190,7 +6320,7 @@
           </w:tcPr>
           <w:p>
             <w:pPr>
-              <w:jc w:val="both"/>
+              <w:jc w:val="left"/>
               <w:rPr>
                 <w:sz w:val="24"/>
                 <w:szCs w:val="24"/>
@@ -6208,6 +6338,7 @@
       </w:tr>
       <w:tr>
         <w:trPr>
+          <w:cantSplit/>
           <w:jc w:val="center"/>
         </w:trPr>
         <w:tc>
@@ -6279,7 +6410,7 @@
           </w:tcPr>
           <w:p>
             <w:pPr>
-              <w:jc w:val="both"/>
+              <w:jc w:val="left"/>
               <w:rPr>
                 <w:sz w:val="24"/>
                 <w:szCs w:val="24"/>
@@ -6307,7 +6438,7 @@
           </w:tcPr>
           <w:p>
             <w:pPr>
-              <w:jc w:val="both"/>
+              <w:jc w:val="left"/>
               <w:rPr>
                 <w:sz w:val="24"/>
                 <w:szCs w:val="24"/>
@@ -6335,7 +6466,7 @@
           </w:tcPr>
           <w:p>
             <w:pPr>
-              <w:jc w:val="both"/>
+              <w:jc w:val="left"/>
               <w:rPr>
                 <w:sz w:val="24"/>
                 <w:szCs w:val="24"/>
@@ -6363,7 +6494,7 @@
           </w:tcPr>
           <w:p>
             <w:pPr>
-              <w:jc w:val="both"/>
+              <w:jc w:val="left"/>
               <w:rPr>
                 <w:sz w:val="24"/>
                 <w:szCs w:val="24"/>
@@ -6381,6 +6512,7 @@
       </w:tr>
       <w:tr>
         <w:trPr>
+          <w:cantSplit/>
           <w:jc w:val="center"/>
         </w:trPr>
         <w:tc>
@@ -6452,7 +6584,7 @@
           </w:tcPr>
           <w:p>
             <w:pPr>
-              <w:jc w:val="both"/>
+              <w:jc w:val="left"/>
               <w:rPr>
                 <w:sz w:val="24"/>
                 <w:szCs w:val="24"/>
@@ -6480,7 +6612,7 @@
           </w:tcPr>
           <w:p>
             <w:pPr>
-              <w:jc w:val="both"/>
+              <w:jc w:val="left"/>
               <w:rPr>
                 <w:sz w:val="24"/>
                 <w:szCs w:val="24"/>
@@ -6508,7 +6640,7 @@
           </w:tcPr>
           <w:p>
             <w:pPr>
-              <w:jc w:val="both"/>
+              <w:jc w:val="left"/>
               <w:rPr>
                 <w:sz w:val="24"/>
                 <w:szCs w:val="24"/>
@@ -6536,7 +6668,7 @@
           </w:tcPr>
           <w:p>
             <w:pPr>
-              <w:jc w:val="both"/>
+              <w:jc w:val="left"/>
               <w:rPr>
                 <w:sz w:val="24"/>
                 <w:szCs w:val="24"/>
@@ -6554,6 +6686,7 @@
       </w:tr>
       <w:tr>
         <w:trPr>
+          <w:cantSplit/>
           <w:jc w:val="center"/>
         </w:trPr>
         <w:tc>
@@ -6625,7 +6758,7 @@
           </w:tcPr>
           <w:p>
             <w:pPr>
-              <w:jc w:val="both"/>
+              <w:jc w:val="left"/>
               <w:rPr>
                 <w:sz w:val="24"/>
                 <w:szCs w:val="24"/>
@@ -6653,7 +6786,7 @@
           </w:tcPr>
           <w:p>
             <w:pPr>
-              <w:jc w:val="both"/>
+              <w:jc w:val="left"/>
               <w:rPr>
                 <w:sz w:val="24"/>
                 <w:szCs w:val="24"/>
@@ -6681,7 +6814,7 @@
           </w:tcPr>
           <w:p>
             <w:pPr>
-              <w:jc w:val="both"/>
+              <w:jc w:val="left"/>
               <w:rPr>
                 <w:sz w:val="24"/>
                 <w:szCs w:val="24"/>
@@ -6709,7 +6842,7 @@
           </w:tcPr>
           <w:p>
             <w:pPr>
-              <w:jc w:val="both"/>
+              <w:jc w:val="left"/>
               <w:rPr>
                 <w:sz w:val="24"/>
                 <w:szCs w:val="24"/>
@@ -6727,6 +6860,7 @@
       </w:tr>
       <w:tr>
         <w:trPr>
+          <w:cantSplit/>
           <w:jc w:val="center"/>
         </w:trPr>
         <w:tc>
@@ -6797,7 +6931,7 @@
           </w:tcPr>
           <w:p>
             <w:pPr>
-              <w:jc w:val="both"/>
+              <w:jc w:val="left"/>
               <w:rPr>
                 <w:sz w:val="24"/>
                 <w:szCs w:val="24"/>
@@ -6825,7 +6959,7 @@
           </w:tcPr>
           <w:p>
             <w:pPr>
-              <w:jc w:val="both"/>
+              <w:jc w:val="left"/>
               <w:rPr>
                 <w:sz w:val="24"/>
                 <w:szCs w:val="24"/>
@@ -6853,7 +6987,7 @@
           </w:tcPr>
           <w:p>
             <w:pPr>
-              <w:jc w:val="both"/>
+              <w:jc w:val="left"/>
               <w:rPr>
                 <w:sz w:val="24"/>
                 <w:szCs w:val="24"/>
@@ -6881,7 +7015,7 @@
           </w:tcPr>
           <w:p>
             <w:pPr>
-              <w:jc w:val="both"/>
+              <w:jc w:val="left"/>
               <w:rPr>
                 <w:sz w:val="24"/>
                 <w:szCs w:val="24"/>
@@ -6899,6 +7033,7 @@
       </w:tr>
       <w:tr>
         <w:trPr>
+          <w:cantSplit/>
           <w:jc w:val="center"/>
         </w:trPr>
         <w:tc>
@@ -6969,7 +7104,7 @@
           </w:tcPr>
           <w:p>
             <w:pPr>
-              <w:jc w:val="both"/>
+              <w:jc w:val="left"/>
               <w:rPr>
                 <w:sz w:val="24"/>
                 <w:szCs w:val="24"/>
@@ -6997,7 +7132,7 @@
           </w:tcPr>
           <w:p>
             <w:pPr>
-              <w:jc w:val="both"/>
+              <w:jc w:val="left"/>
               <w:rPr>
                 <w:sz w:val="24"/>
                 <w:szCs w:val="24"/>
@@ -7025,7 +7160,7 @@
           </w:tcPr>
           <w:p>
             <w:pPr>
-              <w:jc w:val="both"/>
+              <w:jc w:val="left"/>
               <w:rPr>
                 <w:sz w:val="24"/>
                 <w:szCs w:val="24"/>
@@ -7053,7 +7188,7 @@
           </w:tcPr>
           <w:p>
             <w:pPr>
-              <w:jc w:val="both"/>
+              <w:jc w:val="left"/>
               <w:rPr>
                 <w:sz w:val="24"/>
                 <w:szCs w:val="24"/>
@@ -7097,6 +7232,7 @@
     <w:p>
       <w:pPr>
         <w:pStyle w:val="Heading2"/>
+        <w:keepNext/>
         <w:numPr>
           <w:ilvl w:val="1"/>
           <w:numId w:val="7"/>
@@ -7126,6 +7262,8 @@
       </w:tblGrid>
       <w:tr>
         <w:trPr>
+          <w:cantSplit/>
+          <w:tblHeader/>
           <w:jc w:val="center"/>
         </w:trPr>
         <w:tc>
@@ -7141,6 +7279,7 @@
           </w:tcPr>
           <w:p>
             <w:pPr>
+              <w:keepNext/>
               <w:jc w:val="center"/>
               <w:rPr>
                 <w:sz w:val="24"/>
@@ -7171,6 +7310,7 @@
           </w:tcPr>
           <w:p>
             <w:pPr>
+              <w:keepNext/>
               <w:jc w:val="center"/>
               <w:rPr>
                 <w:sz w:val="24"/>
@@ -7201,6 +7341,7 @@
           </w:tcPr>
           <w:p>
             <w:pPr>
+              <w:keepNext/>
               <w:jc w:val="center"/>
               <w:rPr>
                 <w:sz w:val="24"/>
@@ -7231,6 +7372,7 @@
           </w:tcPr>
           <w:p>
             <w:pPr>
+              <w:keepNext/>
               <w:jc w:val="center"/>
               <w:rPr>
                 <w:sz w:val="24"/>
@@ -7261,6 +7403,7 @@
           </w:tcPr>
           <w:p>
             <w:pPr>
+              <w:keepNext/>
               <w:jc w:val="center"/>
               <w:rPr>
                 <w:sz w:val="24"/>
@@ -7291,6 +7434,7 @@
           </w:tcPr>
           <w:p>
             <w:pPr>
+              <w:keepNext/>
               <w:jc w:val="center"/>
               <w:rPr>
                 <w:sz w:val="24"/>
@@ -7311,6 +7455,7 @@
       </w:tr>
       <w:tr>
         <w:trPr>
+          <w:cantSplit/>
           <w:jc w:val="center"/>
         </w:trPr>
         <w:tc>
@@ -7381,7 +7526,7 @@
           </w:tcPr>
           <w:p>
             <w:pPr>
-              <w:jc w:val="both"/>
+              <w:jc w:val="left"/>
               <w:rPr>
                 <w:sz w:val="24"/>
                 <w:szCs w:val="24"/>
@@ -7409,7 +7554,7 @@
           </w:tcPr>
           <w:p>
             <w:pPr>
-              <w:jc w:val="both"/>
+              <w:jc w:val="left"/>
               <w:rPr>
                 <w:sz w:val="24"/>
                 <w:szCs w:val="24"/>
@@ -7437,7 +7582,7 @@
           </w:tcPr>
           <w:p>
             <w:pPr>
-              <w:jc w:val="both"/>
+              <w:jc w:val="left"/>
               <w:rPr>
                 <w:sz w:val="24"/>
                 <w:szCs w:val="24"/>
@@ -7465,7 +7610,7 @@
           </w:tcPr>
           <w:p>
             <w:pPr>
-              <w:jc w:val="both"/>
+              <w:jc w:val="left"/>
               <w:rPr>
                 <w:sz w:val="24"/>
                 <w:szCs w:val="24"/>
@@ -7483,6 +7628,7 @@
       </w:tr>
       <w:tr>
         <w:trPr>
+          <w:cantSplit/>
           <w:jc w:val="center"/>
         </w:trPr>
         <w:tc>
@@ -7553,7 +7699,7 @@
           </w:tcPr>
           <w:p>
             <w:pPr>
-              <w:jc w:val="both"/>
+              <w:jc w:val="left"/>
               <w:rPr>
                 <w:sz w:val="24"/>
                 <w:szCs w:val="24"/>
@@ -7581,7 +7727,7 @@
           </w:tcPr>
           <w:p>
             <w:pPr>
-              <w:jc w:val="both"/>
+              <w:jc w:val="left"/>
               <w:rPr>
                 <w:sz w:val="24"/>
                 <w:szCs w:val="24"/>
@@ -7609,7 +7755,7 @@
           </w:tcPr>
           <w:p>
             <w:pPr>
-              <w:jc w:val="both"/>
+              <w:jc w:val="left"/>
               <w:rPr>
                 <w:sz w:val="24"/>
                 <w:szCs w:val="24"/>
@@ -7637,7 +7783,7 @@
           </w:tcPr>
           <w:p>
             <w:pPr>
-              <w:jc w:val="both"/>
+              <w:jc w:val="left"/>
               <w:rPr>
                 <w:sz w:val="24"/>
                 <w:szCs w:val="24"/>
@@ -7655,6 +7801,7 @@
       </w:tr>
       <w:tr>
         <w:trPr>
+          <w:cantSplit/>
           <w:jc w:val="center"/>
         </w:trPr>
         <w:tc>
@@ -7725,7 +7872,7 @@
           </w:tcPr>
           <w:p>
             <w:pPr>
-              <w:jc w:val="both"/>
+              <w:jc w:val="left"/>
               <w:rPr>
                 <w:sz w:val="24"/>
                 <w:szCs w:val="24"/>
@@ -7753,7 +7900,7 @@
           </w:tcPr>
           <w:p>
             <w:pPr>
-              <w:jc w:val="both"/>
+              <w:jc w:val="left"/>
               <w:rPr>
                 <w:sz w:val="24"/>
                 <w:szCs w:val="24"/>
@@ -7781,7 +7928,7 @@
           </w:tcPr>
           <w:p>
             <w:pPr>
-              <w:jc w:val="both"/>
+              <w:jc w:val="left"/>
               <w:rPr>
                 <w:sz w:val="24"/>
                 <w:szCs w:val="24"/>
@@ -7809,7 +7956,7 @@
           </w:tcPr>
           <w:p>
             <w:pPr>
-              <w:jc w:val="both"/>
+              <w:jc w:val="left"/>
               <w:rPr>
                 <w:sz w:val="24"/>
                 <w:szCs w:val="24"/>
@@ -7827,6 +7974,7 @@
       </w:tr>
       <w:tr>
         <w:trPr>
+          <w:cantSplit/>
           <w:jc w:val="center"/>
         </w:trPr>
         <w:tc>
@@ -7897,7 +8045,7 @@
           </w:tcPr>
           <w:p>
             <w:pPr>
-              <w:jc w:val="both"/>
+              <w:jc w:val="left"/>
               <w:rPr>
                 <w:sz w:val="24"/>
                 <w:szCs w:val="24"/>
@@ -7925,7 +8073,7 @@
           </w:tcPr>
           <w:p>
             <w:pPr>
-              <w:jc w:val="both"/>
+              <w:jc w:val="left"/>
               <w:rPr>
                 <w:sz w:val="24"/>
                 <w:szCs w:val="24"/>
@@ -7953,7 +8101,7 @@
           </w:tcPr>
           <w:p>
             <w:pPr>
-              <w:jc w:val="both"/>
+              <w:jc w:val="left"/>
               <w:rPr>
                 <w:sz w:val="24"/>
                 <w:szCs w:val="24"/>
@@ -7981,7 +8129,7 @@
           </w:tcPr>
           <w:p>
             <w:pPr>
-              <w:jc w:val="both"/>
+              <w:jc w:val="left"/>
               <w:rPr>
                 <w:sz w:val="24"/>
                 <w:szCs w:val="24"/>
@@ -7999,6 +8147,7 @@
       </w:tr>
       <w:tr>
         <w:trPr>
+          <w:cantSplit/>
           <w:jc w:val="center"/>
         </w:trPr>
         <w:tc>
@@ -8069,7 +8218,7 @@
           </w:tcPr>
           <w:p>
             <w:pPr>
-              <w:jc w:val="both"/>
+              <w:jc w:val="left"/>
               <w:rPr>
                 <w:sz w:val="24"/>
                 <w:szCs w:val="24"/>
@@ -8097,7 +8246,7 @@
           </w:tcPr>
           <w:p>
             <w:pPr>
-              <w:jc w:val="both"/>
+              <w:jc w:val="left"/>
               <w:rPr>
                 <w:sz w:val="24"/>
                 <w:szCs w:val="24"/>
@@ -8125,7 +8274,7 @@
           </w:tcPr>
           <w:p>
             <w:pPr>
-              <w:jc w:val="both"/>
+              <w:jc w:val="left"/>
               <w:rPr>
                 <w:sz w:val="24"/>
                 <w:szCs w:val="24"/>
@@ -8153,7 +8302,7 @@
           </w:tcPr>
           <w:p>
             <w:pPr>
-              <w:jc w:val="both"/>
+              <w:jc w:val="left"/>
               <w:rPr>
                 <w:sz w:val="24"/>
                 <w:szCs w:val="24"/>
@@ -8171,6 +8320,7 @@
       </w:tr>
       <w:tr>
         <w:trPr>
+          <w:cantSplit/>
           <w:jc w:val="center"/>
         </w:trPr>
         <w:tc>
@@ -8241,7 +8391,7 @@
           </w:tcPr>
           <w:p>
             <w:pPr>
-              <w:jc w:val="both"/>
+              <w:jc w:val="left"/>
               <w:rPr>
                 <w:sz w:val="24"/>
                 <w:szCs w:val="24"/>
@@ -8269,7 +8419,7 @@
           </w:tcPr>
           <w:p>
             <w:pPr>
-              <w:jc w:val="both"/>
+              <w:jc w:val="left"/>
               <w:rPr>
                 <w:sz w:val="24"/>
                 <w:szCs w:val="24"/>
@@ -8297,7 +8447,7 @@
           </w:tcPr>
           <w:p>
             <w:pPr>
-              <w:jc w:val="both"/>
+              <w:jc w:val="left"/>
               <w:rPr>
                 <w:sz w:val="24"/>
                 <w:szCs w:val="24"/>
@@ -8325,7 +8475,7 @@
           </w:tcPr>
           <w:p>
             <w:pPr>
-              <w:jc w:val="both"/>
+              <w:jc w:val="left"/>
               <w:rPr>
                 <w:sz w:val="24"/>
                 <w:szCs w:val="24"/>
@@ -8343,6 +8493,7 @@
       </w:tr>
       <w:tr>
         <w:trPr>
+          <w:cantSplit/>
           <w:jc w:val="center"/>
         </w:trPr>
         <w:tc>
@@ -8413,7 +8564,7 @@
           </w:tcPr>
           <w:p>
             <w:pPr>
-              <w:jc w:val="both"/>
+              <w:jc w:val="left"/>
               <w:rPr>
                 <w:sz w:val="24"/>
                 <w:szCs w:val="24"/>
@@ -8441,7 +8592,7 @@
           </w:tcPr>
           <w:p>
             <w:pPr>
-              <w:jc w:val="both"/>
+              <w:jc w:val="left"/>
               <w:rPr>
                 <w:sz w:val="24"/>
                 <w:szCs w:val="24"/>
@@ -8469,7 +8620,7 @@
           </w:tcPr>
           <w:p>
             <w:pPr>
-              <w:jc w:val="both"/>
+              <w:jc w:val="left"/>
               <w:rPr>
                 <w:sz w:val="24"/>
                 <w:szCs w:val="24"/>
@@ -8497,7 +8648,7 @@
           </w:tcPr>
           <w:p>
             <w:pPr>
-              <w:jc w:val="both"/>
+              <w:jc w:val="left"/>
               <w:rPr>
                 <w:sz w:val="24"/>
                 <w:szCs w:val="24"/>
@@ -8515,6 +8666,7 @@
       </w:tr>
       <w:tr>
         <w:trPr>
+          <w:cantSplit/>
           <w:jc w:val="center"/>
         </w:trPr>
         <w:tc>
@@ -8585,7 +8737,7 @@
           </w:tcPr>
           <w:p>
             <w:pPr>
-              <w:jc w:val="both"/>
+              <w:jc w:val="left"/>
               <w:rPr>
                 <w:sz w:val="24"/>
                 <w:szCs w:val="24"/>
@@ -8613,7 +8765,7 @@
           </w:tcPr>
           <w:p>
             <w:pPr>
-              <w:jc w:val="both"/>
+              <w:jc w:val="left"/>
               <w:rPr>
                 <w:sz w:val="24"/>
                 <w:szCs w:val="24"/>
@@ -8641,7 +8793,7 @@
           </w:tcPr>
           <w:p>
             <w:pPr>
-              <w:jc w:val="both"/>
+              <w:jc w:val="left"/>
               <w:rPr>
                 <w:sz w:val="24"/>
                 <w:szCs w:val="24"/>
@@ -8669,7 +8821,7 @@
           </w:tcPr>
           <w:p>
             <w:pPr>
-              <w:jc w:val="both"/>
+              <w:jc w:val="left"/>
               <w:rPr>
                 <w:sz w:val="24"/>
                 <w:szCs w:val="24"/>
@@ -8687,6 +8839,7 @@
       </w:tr>
       <w:tr>
         <w:trPr>
+          <w:cantSplit/>
           <w:jc w:val="center"/>
         </w:trPr>
         <w:tc>
@@ -8757,7 +8910,7 @@
           </w:tcPr>
           <w:p>
             <w:pPr>
-              <w:jc w:val="both"/>
+              <w:jc w:val="left"/>
               <w:rPr>
                 <w:sz w:val="24"/>
                 <w:szCs w:val="24"/>
@@ -8785,7 +8938,7 @@
           </w:tcPr>
           <w:p>
             <w:pPr>
-              <w:jc w:val="both"/>
+              <w:jc w:val="left"/>
               <w:rPr>
                 <w:sz w:val="24"/>
                 <w:szCs w:val="24"/>
@@ -8813,7 +8966,7 @@
           </w:tcPr>
           <w:p>
             <w:pPr>
-              <w:jc w:val="both"/>
+              <w:jc w:val="left"/>
               <w:rPr>
                 <w:sz w:val="24"/>
                 <w:szCs w:val="24"/>
@@ -8841,7 +8994,7 @@
           </w:tcPr>
           <w:p>
             <w:pPr>
-              <w:jc w:val="both"/>
+              <w:jc w:val="left"/>
               <w:rPr>
                 <w:sz w:val="24"/>
                 <w:szCs w:val="24"/>
@@ -8859,6 +9012,7 @@
       </w:tr>
       <w:tr>
         <w:trPr>
+          <w:cantSplit/>
           <w:jc w:val="center"/>
         </w:trPr>
         <w:tc>
@@ -8929,7 +9083,7 @@
           </w:tcPr>
           <w:p>
             <w:pPr>
-              <w:jc w:val="both"/>
+              <w:jc w:val="left"/>
               <w:rPr>
                 <w:sz w:val="24"/>
                 <w:szCs w:val="24"/>
@@ -8957,7 +9111,7 @@
           </w:tcPr>
           <w:p>
             <w:pPr>
-              <w:jc w:val="both"/>
+              <w:jc w:val="left"/>
               <w:rPr>
                 <w:sz w:val="24"/>
                 <w:szCs w:val="24"/>
@@ -8985,7 +9139,7 @@
           </w:tcPr>
           <w:p>
             <w:pPr>
-              <w:jc w:val="both"/>
+              <w:jc w:val="left"/>
               <w:rPr>
                 <w:sz w:val="24"/>
                 <w:szCs w:val="24"/>
@@ -9013,7 +9167,7 @@
           </w:tcPr>
           <w:p>
             <w:pPr>
-              <w:jc w:val="both"/>
+              <w:jc w:val="left"/>
               <w:rPr>
                 <w:sz w:val="24"/>
                 <w:szCs w:val="24"/>
@@ -9031,6 +9185,7 @@
       </w:tr>
       <w:tr>
         <w:trPr>
+          <w:cantSplit/>
           <w:jc w:val="center"/>
         </w:trPr>
         <w:tc>
@@ -9101,7 +9256,7 @@
           </w:tcPr>
           <w:p>
             <w:pPr>
-              <w:jc w:val="both"/>
+              <w:jc w:val="left"/>
               <w:rPr>
                 <w:sz w:val="24"/>
                 <w:szCs w:val="24"/>
@@ -9129,7 +9284,7 @@
           </w:tcPr>
           <w:p>
             <w:pPr>
-              <w:jc w:val="both"/>
+              <w:jc w:val="left"/>
               <w:rPr>
                 <w:sz w:val="24"/>
                 <w:szCs w:val="24"/>
@@ -9157,7 +9312,7 @@
           </w:tcPr>
           <w:p>
             <w:pPr>
-              <w:jc w:val="both"/>
+              <w:jc w:val="left"/>
               <w:rPr>
                 <w:sz w:val="24"/>
                 <w:szCs w:val="24"/>
@@ -9185,7 +9340,7 @@
           </w:tcPr>
           <w:p>
             <w:pPr>
-              <w:jc w:val="both"/>
+              <w:jc w:val="left"/>
               <w:rPr>
                 <w:sz w:val="24"/>
                 <w:szCs w:val="24"/>
@@ -9229,6 +9384,7 @@
     <w:p>
       <w:pPr>
         <w:pStyle w:val="Heading2"/>
+        <w:keepNext/>
         <w:numPr>
           <w:ilvl w:val="1"/>
           <w:numId w:val="7"/>
@@ -9257,6 +9413,8 @@
       </w:tblGrid>
       <w:tr>
         <w:trPr>
+          <w:cantSplit/>
+          <w:tblHeader/>
           <w:jc w:val="center"/>
         </w:trPr>
         <w:tc>
@@ -9272,6 +9430,7 @@
           </w:tcPr>
           <w:p>
             <w:pPr>
+              <w:keepNext/>
               <w:jc w:val="center"/>
               <w:rPr>
                 <w:sz w:val="24"/>
@@ -9302,6 +9461,7 @@
           </w:tcPr>
           <w:p>
             <w:pPr>
+              <w:keepNext/>
               <w:jc w:val="center"/>
               <w:rPr>
                 <w:sz w:val="24"/>
@@ -9332,6 +9492,7 @@
           </w:tcPr>
           <w:p>
             <w:pPr>
+              <w:keepNext/>
               <w:jc w:val="center"/>
               <w:rPr>
                 <w:sz w:val="24"/>
@@ -9362,6 +9523,7 @@
           </w:tcPr>
           <w:p>
             <w:pPr>
+              <w:keepNext/>
               <w:jc w:val="center"/>
               <w:rPr>
                 <w:sz w:val="24"/>
@@ -9392,6 +9554,7 @@
           </w:tcPr>
           <w:p>
             <w:pPr>
+              <w:keepNext/>
               <w:jc w:val="center"/>
               <w:rPr>
                 <w:sz w:val="24"/>
@@ -9412,6 +9575,7 @@
       </w:tr>
       <w:tr>
         <w:trPr>
+          <w:cantSplit/>
           <w:jc w:val="center"/>
         </w:trPr>
         <w:tc>
@@ -9482,7 +9646,7 @@
           </w:tcPr>
           <w:p>
             <w:pPr>
-              <w:jc w:val="both"/>
+              <w:jc w:val="left"/>
               <w:rPr>
                 <w:sz w:val="24"/>
                 <w:szCs w:val="24"/>
@@ -9510,7 +9674,7 @@
           </w:tcPr>
           <w:p>
             <w:pPr>
-              <w:jc w:val="both"/>
+              <w:jc w:val="left"/>
               <w:rPr>
                 <w:sz w:val="24"/>
                 <w:szCs w:val="24"/>
@@ -9538,7 +9702,7 @@
           </w:tcPr>
           <w:p>
             <w:pPr>
-              <w:jc w:val="both"/>
+              <w:jc w:val="left"/>
               <w:rPr>
                 <w:sz w:val="24"/>
                 <w:szCs w:val="24"/>
@@ -9556,6 +9720,7 @@
       </w:tr>
       <w:tr>
         <w:trPr>
+          <w:cantSplit/>
           <w:jc w:val="center"/>
         </w:trPr>
         <w:tc>
@@ -9626,7 +9791,7 @@
           </w:tcPr>
           <w:p>
             <w:pPr>
-              <w:jc w:val="both"/>
+              <w:jc w:val="left"/>
               <w:rPr>
                 <w:sz w:val="24"/>
                 <w:szCs w:val="24"/>
@@ -9654,7 +9819,7 @@
           </w:tcPr>
           <w:p>
             <w:pPr>
-              <w:jc w:val="both"/>
+              <w:jc w:val="left"/>
               <w:rPr>
                 <w:sz w:val="24"/>
                 <w:szCs w:val="24"/>
@@ -9682,7 +9847,7 @@
           </w:tcPr>
           <w:p>
             <w:pPr>
-              <w:jc w:val="both"/>
+              <w:jc w:val="left"/>
               <w:rPr>
                 <w:sz w:val="24"/>
                 <w:szCs w:val="24"/>
@@ -9700,6 +9865,7 @@
       </w:tr>
       <w:tr>
         <w:trPr>
+          <w:cantSplit/>
           <w:jc w:val="center"/>
         </w:trPr>
         <w:tc>
@@ -9770,7 +9936,7 @@
           </w:tcPr>
           <w:p>
             <w:pPr>
-              <w:jc w:val="both"/>
+              <w:jc w:val="left"/>
               <w:rPr>
                 <w:sz w:val="24"/>
                 <w:szCs w:val="24"/>
@@ -9798,7 +9964,7 @@
           </w:tcPr>
           <w:p>
             <w:pPr>
-              <w:jc w:val="both"/>
+              <w:jc w:val="left"/>
               <w:rPr>
                 <w:sz w:val="24"/>
                 <w:szCs w:val="24"/>
@@ -9826,7 +9992,7 @@
           </w:tcPr>
           <w:p>
             <w:pPr>
-              <w:jc w:val="both"/>
+              <w:jc w:val="left"/>
               <w:rPr>
                 <w:sz w:val="24"/>
                 <w:szCs w:val="24"/>
@@ -9870,6 +10036,7 @@
     <w:p>
       <w:pPr>
         <w:pStyle w:val="Heading2"/>
+        <w:keepNext/>
         <w:numPr>
           <w:ilvl w:val="1"/>
           <w:numId w:val="7"/>
@@ -9897,6 +10064,8 @@
       </w:tblGrid>
       <w:tr>
         <w:trPr>
+          <w:cantSplit/>
+          <w:tblHeader/>
           <w:jc w:val="center"/>
         </w:trPr>
         <w:tc>
@@ -9912,6 +10081,7 @@
           </w:tcPr>
           <w:p>
             <w:pPr>
+              <w:keepNext/>
               <w:jc w:val="center"/>
               <w:rPr>
                 <w:sz w:val="24"/>
@@ -9942,6 +10112,7 @@
           </w:tcPr>
           <w:p>
             <w:pPr>
+              <w:keepNext/>
               <w:jc w:val="center"/>
               <w:rPr>
                 <w:sz w:val="24"/>
@@ -9972,6 +10143,7 @@
           </w:tcPr>
           <w:p>
             <w:pPr>
+              <w:keepNext/>
               <w:jc w:val="center"/>
               <w:rPr>
                 <w:sz w:val="24"/>
@@ -10002,6 +10174,7 @@
           </w:tcPr>
           <w:p>
             <w:pPr>
+              <w:keepNext/>
               <w:jc w:val="center"/>
               <w:rPr>
                 <w:sz w:val="24"/>
@@ -10022,6 +10195,7 @@
       </w:tr>
       <w:tr>
         <w:trPr>
+          <w:cantSplit/>
           <w:jc w:val="center"/>
         </w:trPr>
         <w:tc>
@@ -10091,7 +10265,7 @@
           </w:tcPr>
           <w:p>
             <w:pPr>
-              <w:jc w:val="both"/>
+              <w:jc w:val="left"/>
               <w:rPr>
                 <w:sz w:val="24"/>
                 <w:szCs w:val="24"/>
@@ -10119,7 +10293,7 @@
           </w:tcPr>
           <w:p>
             <w:pPr>
-              <w:jc w:val="both"/>
+              <w:jc w:val="left"/>
               <w:rPr>
                 <w:sz w:val="24"/>
                 <w:szCs w:val="24"/>
@@ -10137,6 +10311,7 @@
       </w:tr>
       <w:tr>
         <w:trPr>
+          <w:cantSplit/>
           <w:jc w:val="center"/>
         </w:trPr>
         <w:tc>
@@ -10206,7 +10381,7 @@
           </w:tcPr>
           <w:p>
             <w:pPr>
-              <w:jc w:val="both"/>
+              <w:jc w:val="left"/>
               <w:rPr>
                 <w:sz w:val="24"/>
                 <w:szCs w:val="24"/>
@@ -10234,7 +10409,7 @@
           </w:tcPr>
           <w:p>
             <w:pPr>
-              <w:jc w:val="both"/>
+              <w:jc w:val="left"/>
               <w:rPr>
                 <w:sz w:val="24"/>
                 <w:szCs w:val="24"/>
@@ -10252,6 +10427,7 @@
       </w:tr>
       <w:tr>
         <w:trPr>
+          <w:cantSplit/>
           <w:jc w:val="center"/>
         </w:trPr>
         <w:tc>
@@ -10321,7 +10497,7 @@
           </w:tcPr>
           <w:p>
             <w:pPr>
-              <w:jc w:val="both"/>
+              <w:jc w:val="left"/>
               <w:rPr>
                 <w:sz w:val="24"/>
                 <w:szCs w:val="24"/>
@@ -10349,7 +10525,7 @@
           </w:tcPr>
           <w:p>
             <w:pPr>
-              <w:jc w:val="both"/>
+              <w:jc w:val="left"/>
               <w:rPr>
                 <w:sz w:val="24"/>
                 <w:szCs w:val="24"/>
@@ -10393,6 +10569,7 @@
     <w:p>
       <w:pPr>
         <w:pStyle w:val="Heading1"/>
+        <w:keepNext/>
         <w:numPr>
           <w:ilvl w:val="0"/>
           <w:numId w:val="7"/>
@@ -10418,6 +10595,8 @@
       </w:tblGrid>
       <w:tr>
         <w:trPr>
+          <w:cantSplit/>
+          <w:tblHeader/>
           <w:jc w:val="center"/>
         </w:trPr>
         <w:tc>
@@ -10433,6 +10612,7 @@
           </w:tcPr>
           <w:p>
             <w:pPr>
+              <w:keepNext/>
               <w:jc w:val="center"/>
               <w:rPr>
                 <w:sz w:val="24"/>
@@ -10463,6 +10643,7 @@
           </w:tcPr>
           <w:p>
             <w:pPr>
+              <w:keepNext/>
               <w:jc w:val="center"/>
               <w:rPr>
                 <w:sz w:val="24"/>
@@ -10483,6 +10664,7 @@
       </w:tr>
       <w:tr>
         <w:trPr>
+          <w:cantSplit/>
           <w:jc w:val="center"/>
         </w:trPr>
         <w:tc>
@@ -10544,6 +10726,7 @@
       </w:tr>
       <w:tr>
         <w:trPr>
+          <w:cantSplit/>
           <w:jc w:val="center"/>
         </w:trPr>
         <w:tc>
@@ -10598,13 +10781,14 @@
                 <w:sz w:val="24"/>
                 <w:szCs w:val="24"/>
               </w:rPr>
-              <w:t>Legal Document Control &amp; Retention. Tempat usulan penetapan periode retensi dokumen legal serta pembagian pemilik dan pencatat rekaman Legal.</w:t>
+              <w:t>Legal Document Control &amp; Retention. Memuat usulan masa simpan dokumen legal serta pembagian pemilik dan pencatat record Legal.</w:t>
             </w:r>
           </w:p>
         </w:tc>
       </w:tr>
       <w:tr>
         <w:trPr>
+          <w:cantSplit/>
           <w:jc w:val="center"/>
         </w:trPr>
         <w:tc>
@@ -10666,6 +10850,7 @@
       </w:tr>
       <w:tr>
         <w:trPr>
+          <w:cantSplit/>
           <w:jc w:val="center"/>
         </w:trPr>
         <w:tc>
@@ -10720,13 +10905,14 @@
                 <w:sz w:val="24"/>
                 <w:szCs w:val="24"/>
               </w:rPr>
-              <w:t>Company Legal Documents Register. Daftar dokumen legal dan korporasi perusahaan. Batas pencatatannya dengan register ini, misalnya untuk Akta Pendirian dan Anggaran Dasar, belum diputus Legal.</w:t>
+              <w:t>Company Legal Documents Register. Daftar dokumen legal dan korporasi perusahaan. Batas pencatatan antara register itu dan register ini, misalnya untuk Akta Pendirian dan Anggaran Dasar, belum diputuskan Legal.</w:t>
             </w:r>
           </w:p>
         </w:tc>
       </w:tr>
       <w:tr>
         <w:trPr>
+          <w:cantSplit/>
           <w:jc w:val="center"/>
         </w:trPr>
         <w:tc>
@@ -10781,13 +10967,14 @@
                 <w:sz w:val="24"/>
                 <w:szCs w:val="24"/>
               </w:rPr>
-              <w:t>Struktur Organisasi SINUX. Sumber nama peran Line Manager Legal dan Staff Legal, yang dipetakan ke jabatan Legal &amp; Compliance (JA-08 dan JA-09).</w:t>
+              <w:t>Struktur Organisasi SINUX. Sumber nama peran Line Manager Legal dan Staff Legal serta pemetaannya ke jabatan Legal &amp; Compliance (JA-08 dan JA-09).</w:t>
             </w:r>
           </w:p>
         </w:tc>
       </w:tr>
       <w:tr>
         <w:trPr>
+          <w:cantSplit/>
           <w:jc w:val="center"/>
         </w:trPr>
         <w:tc>
@@ -10842,13 +11029,14 @@
                 <w:sz w:val="24"/>
                 <w:szCs w:val="24"/>
               </w:rPr>
-              <w:t>Job Analysis dan Uraian Jabatan. Memuat rutinitas bulanan Staff Legal (JA-09) meninjau register izin.</w:t>
+              <w:t>Job Analysis dan Uraian Jabatan. Memuat rutinitas bulanan Staff Legal (JA-09) untuk meninjau register izin.</w:t>
             </w:r>
           </w:p>
         </w:tc>
       </w:tr>
       <w:tr>
         <w:trPr>
+          <w:cantSplit/>
           <w:jc w:val="center"/>
         </w:trPr>
         <w:tc>
@@ -10910,6 +11098,7 @@
       </w:tr>
       <w:tr>
         <w:trPr>
+          <w:cantSplit/>
           <w:jc w:val="center"/>
         </w:trPr>
         <w:tc>
@@ -11010,6 +11199,7 @@
     <w:p>
       <w:pPr>
         <w:pStyle w:val="Heading2"/>
+        <w:keepNext/>
         <w:numPr>
           <w:ilvl w:val="1"/>
           <w:numId w:val="7"/>
@@ -11036,6 +11226,8 @@
       </w:tblGrid>
       <w:tr>
         <w:trPr>
+          <w:cantSplit/>
+          <w:tblHeader/>
           <w:jc w:val="center"/>
         </w:trPr>
         <w:tc>
@@ -11051,6 +11243,7 @@
           </w:tcPr>
           <w:p>
             <w:pPr>
+              <w:keepNext/>
               <w:jc w:val="center"/>
               <w:rPr>
                 <w:sz w:val="24"/>
@@ -11064,7 +11257,7 @@
                 <w:sz w:val="24"/>
                 <w:szCs w:val="24"/>
               </w:rPr>
-              <w:t>Rekaman</w:t>
+              <w:t>Record</w:t>
             </w:r>
           </w:p>
         </w:tc>
@@ -11081,6 +11274,7 @@
           </w:tcPr>
           <w:p>
             <w:pPr>
+              <w:keepNext/>
               <w:jc w:val="center"/>
               <w:rPr>
                 <w:sz w:val="24"/>
@@ -11111,6 +11305,7 @@
           </w:tcPr>
           <w:p>
             <w:pPr>
+              <w:keepNext/>
               <w:jc w:val="center"/>
               <w:rPr>
                 <w:sz w:val="24"/>
@@ -11131,6 +11326,7 @@
       </w:tr>
       <w:tr>
         <w:trPr>
+          <w:cantSplit/>
           <w:jc w:val="center"/>
         </w:trPr>
         <w:tc>
@@ -11185,7 +11381,7 @@
                 <w:sz w:val="24"/>
                 <w:szCs w:val="24"/>
               </w:rPr>
-              <w:t>Folder Google Drive departemen Legal (Ketentuan butir 10). Pemilik: Line Manager Legal. Pencatat: Staff Legal. Pembagian ini mengikuti SNX-LEG-SOP-03 (USULAN). Klasifikasi RESTRICTED (Internal) menurut SNX-ISMS-PRO-01.</w:t>
+              <w:t>Folder Google Drive Departemen Legal. Pemilik: Line Manager Legal. Pencatat: Staff Legal. Pembagian ini mengikuti SNX-LEG-SOP-03 (USULAN). Klasifikasi RESTRICTED (Internal) menurut SNX-ISMS-PRO-01.</w:t>
             </w:r>
           </w:p>
         </w:tc>
@@ -11202,25 +11398,26 @@
           </w:tcPr>
           <w:p>
             <w:pPr>
-              <w:jc w:val="both"/>
-              <w:rPr>
-                <w:sz w:val="24"/>
-                <w:szCs w:val="24"/>
-              </w:rPr>
-            </w:pPr>
-            <w:r>
-              <w:rPr>
-                <w:b w:val="0"/>
-                <w:sz w:val="24"/>
-                <w:szCs w:val="24"/>
-              </w:rPr>
-              <w:t>Belum ditetapkan. Usulan penetapan ada di SNX-LEG-SOP-03.</w:t>
+              <w:jc w:val="left"/>
+              <w:rPr>
+                <w:sz w:val="24"/>
+                <w:szCs w:val="24"/>
+              </w:rPr>
+            </w:pPr>
+            <w:r>
+              <w:rPr>
+                <w:b w:val="0"/>
+                <w:sz w:val="24"/>
+                <w:szCs w:val="24"/>
+              </w:rPr>
+              <w:t>Belum ditetapkan. Usulan masa simpan disusun di SNX-LEG-SOP-03.</w:t>
             </w:r>
           </w:p>
         </w:tc>
       </w:tr>
       <w:tr>
         <w:trPr>
+          <w:cantSplit/>
           <w:jc w:val="center"/>
         </w:trPr>
         <w:tc>
@@ -11292,19 +11489,19 @@
           </w:tcPr>
           <w:p>
             <w:pPr>
-              <w:jc w:val="both"/>
-              <w:rPr>
-                <w:sz w:val="24"/>
-                <w:szCs w:val="24"/>
-              </w:rPr>
-            </w:pPr>
-            <w:r>
-              <w:rPr>
-                <w:b w:val="0"/>
-                <w:sz w:val="24"/>
-                <w:szCs w:val="24"/>
-              </w:rPr>
-              <w:t>Belum ditetapkan. Usulan penetapan ada di SNX-LEG-SOP-03.</w:t>
+              <w:jc w:val="left"/>
+              <w:rPr>
+                <w:sz w:val="24"/>
+                <w:szCs w:val="24"/>
+              </w:rPr>
+            </w:pPr>
+            <w:r>
+              <w:rPr>
+                <w:b w:val="0"/>
+                <w:sz w:val="24"/>
+                <w:szCs w:val="24"/>
+              </w:rPr>
+              <w:t>Belum ditetapkan. Usulan masa simpan disusun di SNX-LEG-SOP-03.</w:t>
             </w:r>
           </w:p>
         </w:tc>
@@ -11349,6 +11546,7 @@
     </w:p>
     <w:p>
       <w:pPr>
+        <w:keepNext/>
         <w:pBdr>
           <w:top w:val="nil"/>
           <w:left w:val="nil"/>
@@ -11368,7 +11566,7 @@
           <w:sz w:val="24"/>
           <w:szCs w:val="24"/>
         </w:rPr>
-        <w:t xml:space="preserve">Klausul berikut berstatus (USULAN, perlu konfirmasi konsultan).</w:t>
+        <w:t xml:space="preserve">Klausul berikut masih perlu dikonfirmasi konsultan (USULAN).</w:t>
       </w:r>
     </w:p>
     <w:tbl>
@@ -11387,6 +11585,8 @@
       </w:tblGrid>
       <w:tr>
         <w:trPr>
+          <w:cantSplit/>
+          <w:tblHeader/>
           <w:jc w:val="center"/>
         </w:trPr>
         <w:tc>
@@ -11402,6 +11602,7 @@
           </w:tcPr>
           <w:p>
             <w:pPr>
+              <w:keepNext/>
               <w:jc w:val="center"/>
               <w:rPr>
                 <w:sz w:val="24"/>
@@ -11432,6 +11633,7 @@
           </w:tcPr>
           <w:p>
             <w:pPr>
+              <w:keepNext/>
               <w:jc w:val="center"/>
               <w:rPr>
                 <w:sz w:val="24"/>
@@ -11462,6 +11664,7 @@
           </w:tcPr>
           <w:p>
             <w:pPr>
+              <w:keepNext/>
               <w:jc w:val="center"/>
               <w:rPr>
                 <w:sz w:val="24"/>
@@ -11482,6 +11685,7 @@
       </w:tr>
       <w:tr>
         <w:trPr>
+          <w:cantSplit/>
           <w:jc w:val="center"/>
         </w:trPr>
         <w:tc>
@@ -11553,25 +11757,26 @@
           </w:tcPr>
           <w:p>
             <w:pPr>
-              <w:jc w:val="both"/>
-              <w:rPr>
-                <w:sz w:val="24"/>
-                <w:szCs w:val="24"/>
-              </w:rPr>
-            </w:pPr>
-            <w:r>
-              <w:rPr>
-                <w:b w:val="0"/>
-                <w:sz w:val="24"/>
-                <w:szCs w:val="24"/>
-              </w:rPr>
-              <w:t>Perizinan dan legalitas adalah persyaratan instansi berwenang yang relevan bagi kegiatan usaha SINUX.</w:t>
+              <w:jc w:val="left"/>
+              <w:rPr>
+                <w:sz w:val="24"/>
+                <w:szCs w:val="24"/>
+              </w:rPr>
+            </w:pPr>
+            <w:r>
+              <w:rPr>
+                <w:b w:val="0"/>
+                <w:sz w:val="24"/>
+                <w:szCs w:val="24"/>
+              </w:rPr>
+              <w:t>Perizinan dan legalitas adalah persyaratan instansi berwenang yang relevan dengan kegiatan usaha SINUX.</w:t>
             </w:r>
           </w:p>
         </w:tc>
       </w:tr>
       <w:tr>
         <w:trPr>
+          <w:cantSplit/>
           <w:jc w:val="center"/>
         </w:trPr>
         <w:tc>
@@ -11643,25 +11848,26 @@
           </w:tcPr>
           <w:p>
             <w:pPr>
-              <w:jc w:val="both"/>
-              <w:rPr>
-                <w:sz w:val="24"/>
-                <w:szCs w:val="24"/>
-              </w:rPr>
-            </w:pPr>
-            <w:r>
-              <w:rPr>
-                <w:b w:val="0"/>
-                <w:sz w:val="24"/>
-                <w:szCs w:val="24"/>
-              </w:rPr>
-              <w:t>Register dicatat, disimpan, diperbarui, dan dapat ditelusuri lewat Catatan Pemeriksaan.</w:t>
+              <w:jc w:val="left"/>
+              <w:rPr>
+                <w:sz w:val="24"/>
+                <w:szCs w:val="24"/>
+              </w:rPr>
+            </w:pPr>
+            <w:r>
+              <w:rPr>
+                <w:b w:val="0"/>
+                <w:sz w:val="24"/>
+                <w:szCs w:val="24"/>
+              </w:rPr>
+              <w:t>Register dicatat, disimpan, diperbarui, dan dapat ditelusuri melalui Catatan Pemeriksaan.</w:t>
             </w:r>
           </w:p>
         </w:tc>
       </w:tr>
       <w:tr>
         <w:trPr>
+          <w:cantSplit/>
           <w:jc w:val="center"/>
         </w:trPr>
         <w:tc>
@@ -11733,7 +11939,7 @@
           </w:tcPr>
           <w:p>
             <w:pPr>
-              <w:jc w:val="both"/>
+              <w:jc w:val="left"/>
               <w:rPr>
                 <w:sz w:val="24"/>
                 <w:szCs w:val="24"/>
@@ -11752,6 +11958,7 @@
       </w:tr>
       <w:tr>
         <w:trPr>
+          <w:cantSplit/>
           <w:jc w:val="center"/>
         </w:trPr>
         <w:tc>
@@ -11806,7 +12013,7 @@
                 <w:sz w:val="24"/>
                 <w:szCs w:val="24"/>
               </w:rPr>
-              <w:t>Annex A 5.33 Perlindungan rekaman</w:t>
+              <w:t>Annex A 5.33 Perlindungan record</w:t>
             </w:r>
           </w:p>
         </w:tc>
@@ -11823,7 +12030,7 @@
           </w:tcPr>
           <w:p>
             <w:pPr>
-              <w:jc w:val="both"/>
+              <w:jc w:val="left"/>
               <w:rPr>
                 <w:sz w:val="24"/>
                 <w:szCs w:val="24"/>
@@ -11899,7 +12106,7 @@
           <w:sz w:val="24"/>
           <w:szCs w:val="24"/>
         </w:rPr>
-        <w:t xml:space="preserve">Register ini berstatus Draft dan baru berlaku sesudah Direktur Utama menandatangani blok Approval. Line Manager Legal meninjau dokumen ini setiap tahun, dan Staff Legal meninjau isi register setiap bulan.</w:t>
+        <w:t xml:space="preserve">Register ini berstatus Draft dan baru berlaku setelah Direktur Utama menandatangani blok Approval. Line Manager Legal meninjau dokumen ini setiap tahun, dan Staff Legal meninjau isi register setiap bulan.</w:t>
       </w:r>
     </w:p>
     <w:sectPr>

</xml_diff>